<commit_message>
Deploying to gh-pages from @ Morrison-Lab/psw@2cbfafdcd388a42285777da101823b47ee62bd88 🚀
</commit_message>
<xml_diff>
--- a/chapters/grammar.docx
+++ b/chapters/grammar.docx
@@ -15,7 +15,7 @@
         <w:pStyle w:val="Date"/>
       </w:pPr>
       <w:r>
-        <w:t xml:space="preserve">Last modified: 2026-10-05 07:15:27 (UTC)</w:t>
+        <w:t xml:space="preserve">Last modified: 2026-10-05 08:53:46 (UTC)</w:t>
       </w:r>
     </w:p>
     <w:tbl>
@@ -1221,6 +1221,64 @@
         <w:t xml:space="preserve">is.</w:t>
       </w:r>
     </w:p>
+    <w:p>
+      <w:pPr>
+        <w:pStyle w:val="BodyText"/>
+      </w:pPr>
+      <w:r>
+        <w:t xml:space="preserve">A demonstrative at the end of a sentence</w:t>
+      </w:r>
+      <w:r>
+        <w:t xml:space="preserve"> </w:t>
+      </w:r>
+      <w:r>
+        <w:t xml:space="preserve">has no room after it for a naming noun,</w:t>
+      </w:r>
+      <w:r>
+        <w:t xml:space="preserve"> </w:t>
+      </w:r>
+      <w:r>
+        <w:t xml:space="preserve">so a bare sentence-final</w:t>
+      </w:r>
+      <w:r>
+        <w:t xml:space="preserve"> </w:t>
+      </w:r>
+      <w:r>
+        <w:rPr>
+          <w:i/>
+          <w:iCs/>
+        </w:rPr>
+        <w:t xml:space="preserve">this</w:t>
+      </w:r>
+      <w:r>
+        <w:t xml:space="preserve"> </w:t>
+      </w:r>
+      <w:r>
+        <w:t xml:space="preserve">or</w:t>
+      </w:r>
+      <w:r>
+        <w:t xml:space="preserve"> </w:t>
+      </w:r>
+      <w:r>
+        <w:rPr>
+          <w:i/>
+          <w:iCs/>
+        </w:rPr>
+        <w:t xml:space="preserve">that</w:t>
+      </w:r>
+      <w:r>
+        <w:t xml:space="preserve"> </w:t>
+      </w:r>
+      <w:r>
+        <w:t xml:space="preserve">always leaves its referent unnamed.</w:t>
+      </w:r>
+      <w:r>
+        <w:t xml:space="preserve"> </w:t>
+      </w:r>
+      <w:r>
+        <w:t xml:space="preserve">End the sentence with the noun instead.</w:t>
+      </w:r>
+    </w:p>
     <w:bookmarkStart w:id="18" w:name="exm-demonstrative-pronoun"/>
     <w:p>
       <w:pPr>
@@ -1290,10 +1348,52 @@
     </w:p>
     <w:p>
       <w:pPr>
+        <w:pStyle w:val="BlockText"/>
+      </w:pPr>
+      <w:r>
+        <w:t xml:space="preserve">❌ The first model’s estimates were biased upward. The second model avoids</w:t>
+      </w:r>
+      <w:r>
+        <w:t xml:space="preserve"> </w:t>
+      </w:r>
+      <w:r>
+        <w:rPr>
+          <w:b/>
+          <w:bCs/>
+        </w:rPr>
+        <w:t xml:space="preserve">this</w:t>
+      </w:r>
+      <w:r>
+        <w:t xml:space="preserve">.</w:t>
+      </w:r>
+    </w:p>
+    <w:p>
+      <w:pPr>
+        <w:pStyle w:val="BlockText"/>
+      </w:pPr>
+      <w:r>
+        <w:t xml:space="preserve">✅ The first model’s estimates were biased upward. The second model avoids</w:t>
+      </w:r>
+      <w:r>
+        <w:t xml:space="preserve"> </w:t>
+      </w:r>
+      <w:r>
+        <w:rPr>
+          <w:b/>
+          <w:bCs/>
+        </w:rPr>
+        <w:t xml:space="preserve">this bias</w:t>
+      </w:r>
+      <w:r>
+        <w:t xml:space="preserve">.</w:t>
+      </w:r>
+    </w:p>
+    <w:p>
+      <w:pPr>
         <w:pStyle w:val="FirstParagraph"/>
       </w:pPr>
       <w:r>
-        <w:t xml:space="preserve">Adding the noun</w:t>
+        <w:t xml:space="preserve">Adding the nouns</w:t>
       </w:r>
       <w:r>
         <w:t xml:space="preserve"> </w:t>
@@ -1305,7 +1405,19 @@
         <w:t xml:space="preserve"> </w:t>
       </w:r>
       <w:r>
-        <w:t xml:space="preserve">states exactly what</w:t>
+        <w:t xml:space="preserve">and</w:t>
+      </w:r>
+      <w:r>
+        <w:t xml:space="preserve"> </w:t>
+      </w:r>
+      <w:r>
+        <w:t xml:space="preserve">“bias”</w:t>
+      </w:r>
+      <w:r>
+        <w:t xml:space="preserve"> </w:t>
+      </w:r>
+      <w:r>
+        <w:t xml:space="preserve">states exactly what each</w:t>
       </w:r>
       <w:r>
         <w:t xml:space="preserve"> </w:t>
@@ -1324,10 +1436,533 @@
       </w:r>
       <w:r>
         <w:t xml:space="preserve">instead of leaving the reader to infer it.</w:t>
+      </w:r>
+      <w:r>
+        <w:t xml:space="preserve"> </w:t>
+      </w:r>
+      <w:r>
+        <w:t xml:space="preserve">The second pair ends its sentence with the demonstrative,</w:t>
+      </w:r>
+      <w:r>
+        <w:t xml:space="preserve"> </w:t>
+      </w:r>
+      <w:r>
+        <w:t xml:space="preserve">so the fix has to add the noun after it, at the very end.</w:t>
       </w:r>
     </w:p>
     <w:bookmarkEnd w:id="18"/>
     <w:bookmarkEnd w:id="19"/>
+    <w:bookmarkStart w:id="21" w:name="quantifiers-used-as-pronouns"/>
+    <w:p>
+      <w:pPr>
+        <w:pStyle w:val="Heading2"/>
+      </w:pPr>
+      <w:r>
+        <w:t xml:space="preserve">3 Quantifiers used as pronouns</w:t>
+      </w:r>
+    </w:p>
+    <w:p>
+      <w:pPr>
+        <w:pStyle w:val="FirstParagraph"/>
+      </w:pPr>
+      <w:r>
+        <w:t xml:space="preserve">Words that say how many, or how much, of something</w:t>
+      </w:r>
+      <w:r>
+        <w:t xml:space="preserve"> </w:t>
+      </w:r>
+      <w:r>
+        <w:t xml:space="preserve">cause the same problem as demonstratives</w:t>
+      </w:r>
+      <w:r>
+        <w:t xml:space="preserve"> </w:t>
+      </w:r>
+      <w:r>
+        <w:t xml:space="preserve">when they stand alone in place of a noun.</w:t>
+      </w:r>
+      <w:r>
+        <w:t xml:space="preserve"> </w:t>
+      </w:r>
+      <w:r>
+        <w:t xml:space="preserve">Grammars call these words</w:t>
+      </w:r>
+      <w:r>
+        <w:t xml:space="preserve"> </w:t>
+      </w:r>
+      <w:r>
+        <w:rPr>
+          <w:i/>
+          <w:iCs/>
+        </w:rPr>
+        <w:t xml:space="preserve">quantifiers</w:t>
+      </w:r>
+      <w:r>
+        <w:t xml:space="preserve">,</w:t>
+      </w:r>
+      <w:r>
+        <w:t xml:space="preserve"> </w:t>
+      </w:r>
+      <w:r>
+        <w:t xml:space="preserve">and call a quantifier that stands alone an</w:t>
+      </w:r>
+      <w:r>
+        <w:t xml:space="preserve"> </w:t>
+      </w:r>
+      <w:r>
+        <w:rPr>
+          <w:i/>
+          <w:iCs/>
+        </w:rPr>
+        <w:t xml:space="preserve">indefinite pronoun</w:t>
+      </w:r>
+      <w:r>
+        <w:t xml:space="preserve">.</w:t>
+      </w:r>
+      <w:r>
+        <w:t xml:space="preserve"> </w:t>
+      </w:r>
+      <w:r>
+        <w:t xml:space="preserve">The common ones are:</w:t>
+      </w:r>
+    </w:p>
+    <w:p>
+      <w:pPr>
+        <w:pStyle w:val="Compact"/>
+        <w:numPr>
+          <w:ilvl w:val="0"/>
+          <w:numId w:val="1003"/>
+        </w:numPr>
+      </w:pPr>
+      <w:r>
+        <w:rPr>
+          <w:i/>
+          <w:iCs/>
+        </w:rPr>
+        <w:t xml:space="preserve">both</w:t>
+      </w:r>
+    </w:p>
+    <w:p>
+      <w:pPr>
+        <w:pStyle w:val="Compact"/>
+        <w:numPr>
+          <w:ilvl w:val="0"/>
+          <w:numId w:val="1003"/>
+        </w:numPr>
+      </w:pPr>
+      <w:r>
+        <w:rPr>
+          <w:i/>
+          <w:iCs/>
+        </w:rPr>
+        <w:t xml:space="preserve">all</w:t>
+      </w:r>
+      <w:r>
+        <w:t xml:space="preserve"> </w:t>
+      </w:r>
+      <w:r>
+        <w:t xml:space="preserve">(and counted forms such as</w:t>
+      </w:r>
+      <w:r>
+        <w:t xml:space="preserve"> </w:t>
+      </w:r>
+      <w:r>
+        <w:rPr>
+          <w:i/>
+          <w:iCs/>
+        </w:rPr>
+        <w:t xml:space="preserve">all three</w:t>
+      </w:r>
+      <w:r>
+        <w:t xml:space="preserve">)</w:t>
+      </w:r>
+    </w:p>
+    <w:p>
+      <w:pPr>
+        <w:pStyle w:val="Compact"/>
+        <w:numPr>
+          <w:ilvl w:val="0"/>
+          <w:numId w:val="1003"/>
+        </w:numPr>
+      </w:pPr>
+      <w:r>
+        <w:rPr>
+          <w:i/>
+          <w:iCs/>
+        </w:rPr>
+        <w:t xml:space="preserve">each</w:t>
+      </w:r>
+    </w:p>
+    <w:p>
+      <w:pPr>
+        <w:pStyle w:val="Compact"/>
+        <w:numPr>
+          <w:ilvl w:val="0"/>
+          <w:numId w:val="1003"/>
+        </w:numPr>
+      </w:pPr>
+      <w:r>
+        <w:rPr>
+          <w:i/>
+          <w:iCs/>
+        </w:rPr>
+        <w:t xml:space="preserve">any</w:t>
+      </w:r>
+    </w:p>
+    <w:p>
+      <w:pPr>
+        <w:pStyle w:val="Compact"/>
+        <w:numPr>
+          <w:ilvl w:val="0"/>
+          <w:numId w:val="1003"/>
+        </w:numPr>
+      </w:pPr>
+      <w:r>
+        <w:rPr>
+          <w:i/>
+          <w:iCs/>
+        </w:rPr>
+        <w:t xml:space="preserve">some</w:t>
+      </w:r>
+    </w:p>
+    <w:p>
+      <w:pPr>
+        <w:pStyle w:val="Compact"/>
+        <w:numPr>
+          <w:ilvl w:val="0"/>
+          <w:numId w:val="1003"/>
+        </w:numPr>
+      </w:pPr>
+      <w:r>
+        <w:rPr>
+          <w:i/>
+          <w:iCs/>
+        </w:rPr>
+        <w:t xml:space="preserve">most</w:t>
+      </w:r>
+    </w:p>
+    <w:p>
+      <w:pPr>
+        <w:pStyle w:val="Compact"/>
+        <w:numPr>
+          <w:ilvl w:val="0"/>
+          <w:numId w:val="1003"/>
+        </w:numPr>
+      </w:pPr>
+      <w:r>
+        <w:rPr>
+          <w:i/>
+          <w:iCs/>
+        </w:rPr>
+        <w:t xml:space="preserve">many</w:t>
+      </w:r>
+    </w:p>
+    <w:p>
+      <w:pPr>
+        <w:pStyle w:val="Compact"/>
+        <w:numPr>
+          <w:ilvl w:val="0"/>
+          <w:numId w:val="1003"/>
+        </w:numPr>
+      </w:pPr>
+      <w:r>
+        <w:rPr>
+          <w:i/>
+          <w:iCs/>
+        </w:rPr>
+        <w:t xml:space="preserve">few</w:t>
+      </w:r>
+    </w:p>
+    <w:p>
+      <w:pPr>
+        <w:pStyle w:val="Compact"/>
+        <w:numPr>
+          <w:ilvl w:val="0"/>
+          <w:numId w:val="1003"/>
+        </w:numPr>
+      </w:pPr>
+      <w:r>
+        <w:rPr>
+          <w:i/>
+          <w:iCs/>
+        </w:rPr>
+        <w:t xml:space="preserve">none</w:t>
+      </w:r>
+    </w:p>
+    <w:p>
+      <w:pPr>
+        <w:pStyle w:val="FirstParagraph"/>
+      </w:pPr>
+      <w:r>
+        <w:rPr>
+          <w:i/>
+          <w:iCs/>
+        </w:rPr>
+        <w:t xml:space="preserve">Every</w:t>
+      </w:r>
+      <w:r>
+        <w:t xml:space="preserve"> </w:t>
+      </w:r>
+      <w:r>
+        <w:t xml:space="preserve">belongs to the same family,</w:t>
+      </w:r>
+      <w:r>
+        <w:t xml:space="preserve"> </w:t>
+      </w:r>
+      <w:r>
+        <w:t xml:space="preserve">but it cannot stand alone (</w:t>
+      </w:r>
+      <w:r>
+        <w:t xml:space="preserve">“every”</w:t>
+      </w:r>
+      <w:r>
+        <w:t xml:space="preserve"> </w:t>
+      </w:r>
+      <w:r>
+        <w:t xml:space="preserve">needs a noun, as in</w:t>
+      </w:r>
+      <w:r>
+        <w:t xml:space="preserve"> </w:t>
+      </w:r>
+      <w:r>
+        <w:t xml:space="preserve">“every model”</w:t>
+      </w:r>
+      <w:r>
+        <w:t xml:space="preserve">),</w:t>
+      </w:r>
+      <w:r>
+        <w:t xml:space="preserve"> </w:t>
+      </w:r>
+      <w:r>
+        <w:t xml:space="preserve">so it never causes this problem.</w:t>
+      </w:r>
+    </w:p>
+    <w:p>
+      <w:pPr>
+        <w:pStyle w:val="BodyText"/>
+      </w:pPr>
+      <w:r>
+        <w:t xml:space="preserve">You do not need a complete list of quantifiers to apply the advice.</w:t>
+      </w:r>
+      <w:r>
+        <w:t xml:space="preserve"> </w:t>
+      </w:r>
+      <w:r>
+        <w:t xml:space="preserve">Whenever a quantifier stands where a noun should be,</w:t>
+      </w:r>
+      <w:r>
+        <w:t xml:space="preserve"> </w:t>
+      </w:r>
+      <w:r>
+        <w:t xml:space="preserve">the reader has to search backward to find out what it quantifies.</w:t>
+      </w:r>
+      <w:r>
+        <w:t xml:space="preserve"> </w:t>
+      </w:r>
+      <w:r>
+        <w:t xml:space="preserve">Follow the quantifier with the noun:</w:t>
+      </w:r>
+      <w:r>
+        <w:t xml:space="preserve"> </w:t>
+      </w:r>
+      <w:r>
+        <w:t xml:space="preserve">“</w:t>
+      </w:r>
+      <w:r>
+        <w:rPr>
+          <w:b/>
+          <w:bCs/>
+        </w:rPr>
+        <w:t xml:space="preserve">both models</w:t>
+      </w:r>
+      <w:r>
+        <w:t xml:space="preserve">”</w:t>
+      </w:r>
+      <w:r>
+        <w:t xml:space="preserve">,</w:t>
+      </w:r>
+      <w:r>
+        <w:t xml:space="preserve"> </w:t>
+      </w:r>
+      <w:r>
+        <w:t xml:space="preserve">“</w:t>
+      </w:r>
+      <w:r>
+        <w:rPr>
+          <w:b/>
+          <w:bCs/>
+        </w:rPr>
+        <w:t xml:space="preserve">all three estimators</w:t>
+      </w:r>
+      <w:r>
+        <w:t xml:space="preserve">”</w:t>
+      </w:r>
+      <w:r>
+        <w:t xml:space="preserve">,</w:t>
+      </w:r>
+      <w:r>
+        <w:t xml:space="preserve"> </w:t>
+      </w:r>
+      <w:r>
+        <w:t xml:space="preserve">“</w:t>
+      </w:r>
+      <w:r>
+        <w:rPr>
+          <w:b/>
+          <w:bCs/>
+        </w:rPr>
+        <w:t xml:space="preserve">each interval</w:t>
+      </w:r>
+      <w:r>
+        <w:t xml:space="preserve">”</w:t>
+      </w:r>
+      <w:r>
+        <w:t xml:space="preserve">.</w:t>
+      </w:r>
+      <w:r>
+        <w:t xml:space="preserve"> </w:t>
+      </w:r>
+      <w:r>
+        <w:t xml:space="preserve">An</w:t>
+      </w:r>
+      <w:r>
+        <w:t xml:space="preserve"> </w:t>
+      </w:r>
+      <w:r>
+        <w:t xml:space="preserve">“of”</w:t>
+      </w:r>
+      <w:r>
+        <w:t xml:space="preserve"> </w:t>
+      </w:r>
+      <w:r>
+        <w:t xml:space="preserve">phrase that names the noun works too:</w:t>
+      </w:r>
+      <w:r>
+        <w:t xml:space="preserve"> </w:t>
+      </w:r>
+      <w:r>
+        <w:t xml:space="preserve">“</w:t>
+      </w:r>
+      <w:r>
+        <w:rPr>
+          <w:b/>
+          <w:bCs/>
+        </w:rPr>
+        <w:t xml:space="preserve">none of the intervals</w:t>
+      </w:r>
+      <w:r>
+        <w:t xml:space="preserve">”</w:t>
+      </w:r>
+      <w:r>
+        <w:t xml:space="preserve">.</w:t>
+      </w:r>
+    </w:p>
+    <w:bookmarkStart w:id="20" w:name="exm-quantifier-pronoun"/>
+    <w:p>
+      <w:pPr>
+        <w:pStyle w:val="BodyText"/>
+      </w:pPr>
+      <w:r>
+        <w:rPr>
+          <w:b/>
+          <w:bCs/>
+        </w:rPr>
+        <w:t xml:space="preserve">Example 5 (Naming what a quantifier refers to)</w:t>
+      </w:r>
+      <w:r>
+        <w:t xml:space="preserve"> </w:t>
+      </w:r>
+      <w:r>
+        <w:t xml:space="preserve"> </w:t>
+      </w:r>
+    </w:p>
+    <w:p>
+      <w:pPr>
+        <w:pStyle w:val="BlockText"/>
+      </w:pPr>
+      <w:r>
+        <w:t xml:space="preserve">❌ We fit a linear model and a spline model to the 2019 and 2020 surveys.</w:t>
+      </w:r>
+      <w:r>
+        <w:t xml:space="preserve"> </w:t>
+      </w:r>
+      <w:r>
+        <w:rPr>
+          <w:b/>
+          <w:bCs/>
+        </w:rPr>
+        <w:t xml:space="preserve">Both</w:t>
+      </w:r>
+      <w:r>
+        <w:t xml:space="preserve"> </w:t>
+      </w:r>
+      <w:r>
+        <w:t xml:space="preserve">return the same fit.</w:t>
+      </w:r>
+    </w:p>
+    <w:p>
+      <w:pPr>
+        <w:pStyle w:val="BlockText"/>
+      </w:pPr>
+      <w:r>
+        <w:t xml:space="preserve">✅ We fit a linear model and a spline model to the 2019 and 2020 surveys.</w:t>
+      </w:r>
+      <w:r>
+        <w:t xml:space="preserve"> </w:t>
+      </w:r>
+      <w:r>
+        <w:rPr>
+          <w:b/>
+          <w:bCs/>
+        </w:rPr>
+        <w:t xml:space="preserve">Both models</w:t>
+      </w:r>
+      <w:r>
+        <w:t xml:space="preserve"> </w:t>
+      </w:r>
+      <w:r>
+        <w:t xml:space="preserve">return the same fit.</w:t>
+      </w:r>
+    </w:p>
+    <w:p>
+      <w:pPr>
+        <w:pStyle w:val="FirstParagraph"/>
+      </w:pPr>
+      <w:r>
+        <w:t xml:space="preserve">In the first version,</w:t>
+      </w:r>
+      <w:r>
+        <w:t xml:space="preserve"> </w:t>
+      </w:r>
+      <w:r>
+        <w:t xml:space="preserve">“both”</w:t>
+      </w:r>
+      <w:r>
+        <w:t xml:space="preserve"> </w:t>
+      </w:r>
+      <w:r>
+        <w:t xml:space="preserve">could mean the two models or the two surveys.</w:t>
+      </w:r>
+      <w:r>
+        <w:t xml:space="preserve"> </w:t>
+      </w:r>
+      <w:r>
+        <w:t xml:space="preserve">Adding</w:t>
+      </w:r>
+      <w:r>
+        <w:t xml:space="preserve"> </w:t>
+      </w:r>
+      <w:r>
+        <w:t xml:space="preserve">“models”</w:t>
+      </w:r>
+      <w:r>
+        <w:t xml:space="preserve"> </w:t>
+      </w:r>
+      <w:r>
+        <w:t xml:space="preserve">settles which pair the sentence is about.</w:t>
+      </w:r>
+    </w:p>
+    <w:bookmarkEnd w:id="20"/>
+    <w:bookmarkEnd w:id="21"/>
     <w:sectPr>
       <w:footnotePr>
         <w:numRestart w:val="eachSect"/>
@@ -1548,6 +2183,9 @@
     <w:abstractNumId w:val="991"/>
   </w:num>
   <w:num w:numId="1002">
+    <w:abstractNumId w:val="991"/>
+  </w:num>
+  <w:num w:numId="1003">
     <w:abstractNumId w:val="991"/>
   </w:num>
 </w:numbering>

</xml_diff>

<commit_message>
Deploying to gh-pages from @ Morrison-Lab/psw@5e1c00a0514e60789653276823ec954c2b3e14bd 🚀
</commit_message>
<xml_diff>
--- a/chapters/grammar.docx
+++ b/chapters/grammar.docx
@@ -15,7 +15,7 @@
         <w:pStyle w:val="Date"/>
       </w:pPr>
       <w:r>
-        <w:t xml:space="preserve">Last modified: 2026-10-05 17:44:06 (UTC)</w:t>
+        <w:t xml:space="preserve">Last modified: 2026-10-05 17:47:49 (UTC)</w:t>
       </w:r>
     </w:p>
     <w:tbl>
@@ -1963,6 +1963,289 @@
     </w:p>
     <w:bookmarkEnd w:id="20"/>
     <w:bookmarkEnd w:id="21"/>
+    <w:bookmarkStart w:id="24" w:name="avoid-garden-path-sentences"/>
+    <w:p>
+      <w:pPr>
+        <w:pStyle w:val="Heading2"/>
+      </w:pPr>
+      <w:r>
+        <w:t xml:space="preserve">4 Avoid garden-path sentences</w:t>
+      </w:r>
+    </w:p>
+    <w:p>
+      <w:pPr>
+        <w:pStyle w:val="FirstParagraph"/>
+      </w:pPr>
+      <w:r>
+        <w:t xml:space="preserve">A</w:t>
+      </w:r>
+      <w:r>
+        <w:t xml:space="preserve"> </w:t>
+      </w:r>
+      <w:r>
+        <w:rPr>
+          <w:i/>
+          <w:iCs/>
+        </w:rPr>
+        <w:t xml:space="preserve">garden-path sentence</w:t>
+      </w:r>
+      <w:r>
+        <w:t xml:space="preserve"> </w:t>
+      </w:r>
+      <w:r>
+        <w:t xml:space="preserve">leads the reader into one reading</w:t>
+      </w:r>
+      <w:r>
+        <w:t xml:space="preserve"> </w:t>
+      </w:r>
+      <w:r>
+        <w:t xml:space="preserve">and then forces them to go back and reread</w:t>
+      </w:r>
+      <w:r>
+        <w:t xml:space="preserve"> </w:t>
+      </w:r>
+      <w:r>
+        <w:t xml:space="preserve">when the rest of the sentence does not fit</w:t>
+      </w:r>
+      <w:r>
+        <w:t xml:space="preserve"> </w:t>
+      </w:r>
+      <w:r>
+        <w:t xml:space="preserve">(</w:t>
+      </w:r>
+      <w:hyperlink r:id="rId22">
+        <w:r>
+          <w:rPr>
+            <w:rStyle w:val="Hyperlink"/>
+          </w:rPr>
+          <w:t xml:space="preserve">Wikipedia: Garden-path sentence</w:t>
+        </w:r>
+      </w:hyperlink>
+      <w:r>
+        <w:t xml:space="preserve">).</w:t>
+      </w:r>
+      <w:r>
+        <w:t xml:space="preserve"> </w:t>
+      </w:r>
+      <w:r>
+        <w:t xml:space="preserve">The sentence may be grammatical,</w:t>
+      </w:r>
+      <w:r>
+        <w:t xml:space="preserve"> </w:t>
+      </w:r>
+      <w:r>
+        <w:t xml:space="preserve">but the reader parses it twice.</w:t>
+      </w:r>
+    </w:p>
+    <w:p>
+      <w:pPr>
+        <w:pStyle w:val="BodyText"/>
+      </w:pPr>
+      <w:r>
+        <w:t xml:space="preserve">A common cause in technical writing is a clause that describes a noun</w:t>
+      </w:r>
+      <w:r>
+        <w:t xml:space="preserve"> </w:t>
+      </w:r>
+      <w:r>
+        <w:t xml:space="preserve">but has lost its opening</w:t>
+      </w:r>
+      <w:r>
+        <w:t xml:space="preserve"> </w:t>
+      </w:r>
+      <w:r>
+        <w:rPr>
+          <w:i/>
+          <w:iCs/>
+        </w:rPr>
+        <w:t xml:space="preserve">that</w:t>
+      </w:r>
+      <w:r>
+        <w:t xml:space="preserve"> </w:t>
+      </w:r>
+      <w:r>
+        <w:t xml:space="preserve">or</w:t>
+      </w:r>
+      <w:r>
+        <w:t xml:space="preserve"> </w:t>
+      </w:r>
+      <w:r>
+        <w:rPr>
+          <w:i/>
+          <w:iCs/>
+        </w:rPr>
+        <w:t xml:space="preserve">that were</w:t>
+      </w:r>
+      <w:r>
+        <w:t xml:space="preserve">.</w:t>
+      </w:r>
+      <w:r>
+        <w:t xml:space="preserve"> </w:t>
+      </w:r>
+      <w:r>
+        <w:t xml:space="preserve">Without the pronoun,</w:t>
+      </w:r>
+      <w:r>
+        <w:t xml:space="preserve"> </w:t>
+      </w:r>
+      <w:r>
+        <w:t xml:space="preserve">the reader takes the noun and the start of the clause as one phrase</w:t>
+      </w:r>
+      <w:r>
+        <w:t xml:space="preserve"> </w:t>
+      </w:r>
+      <w:r>
+        <w:t xml:space="preserve">and has to reattach the words that follow.</w:t>
+      </w:r>
+      <w:r>
+        <w:t xml:space="preserve"> </w:t>
+      </w:r>
+      <w:hyperlink w:anchor="do-not-omit-relative-pronouns">
+        <w:r>
+          <w:rPr>
+            <w:rStyle w:val="Hyperlink"/>
+          </w:rPr>
+          <w:t xml:space="preserve">Do not omit relative pronouns</w:t>
+        </w:r>
+      </w:hyperlink>
+      <w:r>
+        <w:t xml:space="preserve"> </w:t>
+      </w:r>
+      <w:r>
+        <w:t xml:space="preserve">gives the general rule.</w:t>
+      </w:r>
+    </w:p>
+    <w:p>
+      <w:pPr>
+        <w:pStyle w:val="BodyText"/>
+      </w:pPr>
+      <w:r>
+        <w:t xml:space="preserve">When you reread a sentence and stumble,</w:t>
+      </w:r>
+      <w:r>
+        <w:t xml:space="preserve"> </w:t>
+      </w:r>
+      <w:r>
+        <w:t xml:space="preserve">find the point where your first reading went wrong,</w:t>
+      </w:r>
+      <w:r>
+        <w:t xml:space="preserve"> </w:t>
+      </w:r>
+      <w:r>
+        <w:t xml:space="preserve">and rewrite the sentence so that the first reading is the right one.</w:t>
+      </w:r>
+    </w:p>
+    <w:bookmarkStart w:id="23" w:name="exm-garden-path"/>
+    <w:p>
+      <w:pPr>
+        <w:pStyle w:val="BodyText"/>
+      </w:pPr>
+      <w:r>
+        <w:rPr>
+          <w:b/>
+          <w:bCs/>
+        </w:rPr>
+        <w:t xml:space="preserve">Example 6 (Rewriting a garden-path sentence)</w:t>
+      </w:r>
+      <w:r>
+        <w:t xml:space="preserve"> </w:t>
+      </w:r>
+      <w:r>
+        <w:t xml:space="preserve"> </w:t>
+      </w:r>
+    </w:p>
+    <w:p>
+      <w:pPr>
+        <w:pStyle w:val="BlockText"/>
+      </w:pPr>
+      <w:r>
+        <w:t xml:space="preserve">❌ Report only SHAs a command you ran printed in full.</w:t>
+      </w:r>
+    </w:p>
+    <w:p>
+      <w:pPr>
+        <w:pStyle w:val="BlockText"/>
+      </w:pPr>
+      <w:r>
+        <w:t xml:space="preserve">✅ Report only SHAs that appeared in full in the output of a command that you ran.</w:t>
+      </w:r>
+    </w:p>
+    <w:p>
+      <w:pPr>
+        <w:pStyle w:val="FirstParagraph"/>
+      </w:pPr>
+      <w:r>
+        <w:t xml:space="preserve">In the first version,</w:t>
+      </w:r>
+      <w:r>
+        <w:t xml:space="preserve"> </w:t>
+      </w:r>
+      <w:r>
+        <w:t xml:space="preserve">the reader takes</w:t>
+      </w:r>
+      <w:r>
+        <w:t xml:space="preserve"> </w:t>
+      </w:r>
+      <w:r>
+        <w:t xml:space="preserve">“SHAs a command you ran”</w:t>
+      </w:r>
+      <w:r>
+        <w:t xml:space="preserve"> </w:t>
+      </w:r>
+      <w:r>
+        <w:t xml:space="preserve">as one phrase,</w:t>
+      </w:r>
+      <w:r>
+        <w:t xml:space="preserve"> </w:t>
+      </w:r>
+      <w:r>
+        <w:t xml:space="preserve">then reaches</w:t>
+      </w:r>
+      <w:r>
+        <w:t xml:space="preserve"> </w:t>
+      </w:r>
+      <w:r>
+        <w:t xml:space="preserve">“printed”</w:t>
+      </w:r>
+      <w:r>
+        <w:t xml:space="preserve"> </w:t>
+      </w:r>
+      <w:r>
+        <w:t xml:space="preserve">and has to work out that</w:t>
+      </w:r>
+      <w:r>
+        <w:t xml:space="preserve"> </w:t>
+      </w:r>
+      <w:r>
+        <w:t xml:space="preserve">“a command you ran printed in full”</w:t>
+      </w:r>
+      <w:r>
+        <w:t xml:space="preserve"> </w:t>
+      </w:r>
+      <w:r>
+        <w:t xml:space="preserve">is a clause describing the SHAs.</w:t>
+      </w:r>
+      <w:r>
+        <w:t xml:space="preserve"> </w:t>
+      </w:r>
+      <w:r>
+        <w:t xml:space="preserve">The rewrite marks the clause with</w:t>
+      </w:r>
+      <w:r>
+        <w:t xml:space="preserve"> </w:t>
+      </w:r>
+      <w:r>
+        <w:t xml:space="preserve">“that”</w:t>
+      </w:r>
+      <w:r>
+        <w:t xml:space="preserve"> </w:t>
+      </w:r>
+      <w:r>
+        <w:t xml:space="preserve">and keeps each verb next to its own subject.</w:t>
+      </w:r>
+    </w:p>
+    <w:bookmarkEnd w:id="23"/>
+    <w:bookmarkEnd w:id="24"/>
     <w:sectPr>
       <w:footnotePr>
         <w:numRestart w:val="eachSect"/>

</xml_diff>

<commit_message>
Deploying to gh-pages from @ Morrison-Lab/psw@c4d4ea5be6b089d9449040f662f13305efe48577 🚀
</commit_message>
<xml_diff>
--- a/chapters/grammar.docx
+++ b/chapters/grammar.docx
@@ -15,7 +15,7 @@
         <w:pStyle w:val="Date"/>
       </w:pPr>
       <w:r>
-        <w:t xml:space="preserve">Last modified: 2026-10-05 17:53:18 (UTC)</w:t>
+        <w:t xml:space="preserve">Last modified: 2026-10-05 18:34:36 (UTC)</w:t>
       </w:r>
     </w:p>
     <w:tbl>
@@ -2042,7 +2042,13 @@
         <w:pStyle w:val="BodyText"/>
       </w:pPr>
       <w:r>
-        <w:t xml:space="preserve">A common cause in technical writing is a clause that describes a noun</w:t>
+        <w:t xml:space="preserve">A common cause of garden-path sentences in technical writing</w:t>
+      </w:r>
+      <w:r>
+        <w:t xml:space="preserve"> </w:t>
+      </w:r>
+      <w:r>
+        <w:t xml:space="preserve">is a clause that describes a noun</w:t>
       </w:r>
       <w:r>
         <w:t xml:space="preserve"> </w:t>

</xml_diff>

<commit_message>
Deploying to gh-pages from @ Morrison-Lab/psw@0f09336da63b34d5c9c1106d7b450c96ffb84d20 🚀
</commit_message>
<xml_diff>
--- a/chapters/grammar.docx
+++ b/chapters/grammar.docx
@@ -15,7 +15,7 @@
         <w:pStyle w:val="Date"/>
       </w:pPr>
       <w:r>
-        <w:t xml:space="preserve">Last modified: 2026-10-16 10:23:00 (PDT)</w:t>
+        <w:t xml:space="preserve">Last modified: 2026-10-16 10:30:48 (PDT)</w:t>
       </w:r>
     </w:p>
     <w:tbl>
@@ -2771,6 +2771,532 @@
     </w:p>
     <w:bookmarkEnd w:id="26"/>
     <w:bookmarkEnd w:id="27"/>
+    <w:bookmarkStart w:id="29" w:name="appositive-fronting"/>
+    <w:p>
+      <w:pPr>
+        <w:pStyle w:val="Heading2"/>
+      </w:pPr>
+      <w:r>
+        <w:t xml:space="preserve">6 Appositive fronting</w:t>
+      </w:r>
+    </w:p>
+    <w:p>
+      <w:pPr>
+        <w:pStyle w:val="FirstParagraph"/>
+      </w:pPr>
+      <w:r>
+        <w:t xml:space="preserve">An</w:t>
+      </w:r>
+      <w:r>
+        <w:t xml:space="preserve"> </w:t>
+      </w:r>
+      <w:r>
+        <w:rPr>
+          <w:i/>
+          <w:iCs/>
+        </w:rPr>
+        <w:t xml:space="preserve">appositive</w:t>
+      </w:r>
+      <w:r>
+        <w:t xml:space="preserve"> </w:t>
+      </w:r>
+      <w:r>
+        <w:t xml:space="preserve">is a noun phrase that renames or describes the noun beside it.</w:t>
+      </w:r>
+      <w:r>
+        <w:t xml:space="preserve"> </w:t>
+      </w:r>
+      <w:r>
+        <w:t xml:space="preserve">In</w:t>
+      </w:r>
+      <w:r>
+        <w:t xml:space="preserve"> </w:t>
+      </w:r>
+      <w:r>
+        <w:t xml:space="preserve">“Bovine respiratory disease (BRD), a disease complex with a multifactorial etiology, kills calves”</w:t>
+      </w:r>
+      <w:r>
+        <w:t xml:space="preserve">,</w:t>
+      </w:r>
+      <w:r>
+        <w:t xml:space="preserve"> </w:t>
+      </w:r>
+      <w:r>
+        <w:t xml:space="preserve">“a disease complex with a multifactorial etiology”</w:t>
+      </w:r>
+      <w:r>
+        <w:t xml:space="preserve"> </w:t>
+      </w:r>
+      <w:r>
+        <w:t xml:space="preserve">is an appositive of</w:t>
+      </w:r>
+      <w:r>
+        <w:t xml:space="preserve"> </w:t>
+      </w:r>
+      <w:r>
+        <w:t xml:space="preserve">“BRD”</w:t>
+      </w:r>
+      <w:r>
+        <w:t xml:space="preserve">.</w:t>
+      </w:r>
+      <w:r>
+        <w:t xml:space="preserve"> </w:t>
+      </w:r>
+      <w:r>
+        <w:rPr>
+          <w:i/>
+          <w:iCs/>
+        </w:rPr>
+        <w:t xml:space="preserve">Appositive fronting</w:t>
+      </w:r>
+      <w:r>
+        <w:t xml:space="preserve"> </w:t>
+      </w:r>
+      <w:r>
+        <w:t xml:space="preserve">moves the appositive to the start of the sentence,</w:t>
+      </w:r>
+      <w:r>
+        <w:t xml:space="preserve"> </w:t>
+      </w:r>
+      <w:r>
+        <w:t xml:space="preserve">before the noun it describes, which then follows as the subject:</w:t>
+      </w:r>
+      <w:r>
+        <w:t xml:space="preserve"> </w:t>
+      </w:r>
+      <w:r>
+        <w:t xml:space="preserve">“A disease complex with a multifactorial etiology, BRD is a leading cause of mortality in calves.”</w:t>
+      </w:r>
+      <w:r>
+        <w:t xml:space="preserve"> </w:t>
+      </w:r>
+      <w:r>
+        <w:t xml:space="preserve">Often the subject becomes a pronoun, as in</w:t>
+      </w:r>
+      <w:r>
+        <w:t xml:space="preserve"> </w:t>
+      </w:r>
+      <w:r>
+        <w:t xml:space="preserve">“A disease complex with a multifactorial etiology, it is a leading cause of mortality in calves”</w:t>
+      </w:r>
+      <w:r>
+        <w:t xml:space="preserve">,</w:t>
+      </w:r>
+      <w:r>
+        <w:t xml:space="preserve"> </w:t>
+      </w:r>
+      <w:r>
+        <w:t xml:space="preserve">which needs an antecedent for</w:t>
+      </w:r>
+      <w:r>
+        <w:t xml:space="preserve"> </w:t>
+      </w:r>
+      <w:r>
+        <w:t xml:space="preserve">“it”</w:t>
+      </w:r>
+      <w:r>
+        <w:t xml:space="preserve"> </w:t>
+      </w:r>
+      <w:r>
+        <w:t xml:space="preserve">in the sentence before.</w:t>
+      </w:r>
+    </w:p>
+    <w:p>
+      <w:pPr>
+        <w:pStyle w:val="BodyText"/>
+      </w:pPr>
+      <w:r>
+        <w:t xml:space="preserve">Fronting is a stylistic choice, with costs and benefits.</w:t>
+      </w:r>
+    </w:p>
+    <w:p>
+      <w:pPr>
+        <w:pStyle w:val="BodyText"/>
+      </w:pPr>
+      <w:r>
+        <w:rPr>
+          <w:b/>
+          <w:bCs/>
+        </w:rPr>
+        <w:t xml:space="preserve">Benefits</w:t>
+      </w:r>
+    </w:p>
+    <w:p>
+      <w:pPr>
+        <w:pStyle w:val="Compact"/>
+        <w:numPr>
+          <w:ilvl w:val="0"/>
+          <w:numId w:val="1006"/>
+        </w:numPr>
+      </w:pPr>
+      <w:r>
+        <w:t xml:space="preserve">It states the category before the specifics.</w:t>
+      </w:r>
+      <w:r>
+        <w:t xml:space="preserve"> </w:t>
+      </w:r>
+      <w:r>
+        <w:t xml:space="preserve">The reader learns what kind of thing the subject is,</w:t>
+      </w:r>
+      <w:r>
+        <w:t xml:space="preserve"> </w:t>
+      </w:r>
+      <w:r>
+        <w:t xml:space="preserve">then what is said about it.</w:t>
+      </w:r>
+    </w:p>
+    <w:p>
+      <w:pPr>
+        <w:pStyle w:val="Compact"/>
+        <w:numPr>
+          <w:ilvl w:val="0"/>
+          <w:numId w:val="1006"/>
+        </w:numPr>
+      </w:pPr>
+      <w:r>
+        <w:t xml:space="preserve">It joins two statements without a connecting verb such as</w:t>
+      </w:r>
+      <w:r>
+        <w:t xml:space="preserve"> </w:t>
+      </w:r>
+      <w:r>
+        <w:t xml:space="preserve">“is”</w:t>
+      </w:r>
+      <w:r>
+        <w:t xml:space="preserve"> </w:t>
+      </w:r>
+      <w:r>
+        <w:t xml:space="preserve">or</w:t>
+      </w:r>
+      <w:r>
+        <w:t xml:space="preserve"> </w:t>
+      </w:r>
+      <w:r>
+        <w:t xml:space="preserve">“serves as”</w:t>
+      </w:r>
+      <w:r>
+        <w:t xml:space="preserve">,</w:t>
+      </w:r>
+      <w:r>
+        <w:t xml:space="preserve"> </w:t>
+      </w:r>
+      <w:r>
+        <w:t xml:space="preserve">so the sentence is shorter.</w:t>
+      </w:r>
+    </w:p>
+    <w:p>
+      <w:pPr>
+        <w:pStyle w:val="Compact"/>
+        <w:numPr>
+          <w:ilvl w:val="0"/>
+          <w:numId w:val="1006"/>
+        </w:numPr>
+      </w:pPr>
+      <w:r>
+        <w:t xml:space="preserve">It puts a familiar description first and the new claim last,</w:t>
+      </w:r>
+      <w:r>
+        <w:t xml:space="preserve"> </w:t>
+      </w:r>
+      <w:r>
+        <w:t xml:space="preserve">where the reader’s attention lands.</w:t>
+      </w:r>
+    </w:p>
+    <w:p>
+      <w:pPr>
+        <w:pStyle w:val="FirstParagraph"/>
+      </w:pPr>
+      <w:r>
+        <w:rPr>
+          <w:b/>
+          <w:bCs/>
+        </w:rPr>
+        <w:t xml:space="preserve">Costs</w:t>
+      </w:r>
+    </w:p>
+    <w:p>
+      <w:pPr>
+        <w:pStyle w:val="Compact"/>
+        <w:numPr>
+          <w:ilvl w:val="0"/>
+          <w:numId w:val="1007"/>
+        </w:numPr>
+      </w:pPr>
+      <w:r>
+        <w:t xml:space="preserve">The fronted phrase must describe the grammatical subject that follows.</w:t>
+      </w:r>
+      <w:r>
+        <w:t xml:space="preserve"> </w:t>
+      </w:r>
+      <w:r>
+        <w:t xml:space="preserve">Otherwise it dangles:</w:t>
+      </w:r>
+      <w:r>
+        <w:t xml:space="preserve"> </w:t>
+      </w:r>
+      <w:r>
+        <w:t xml:space="preserve">“A disease complex with a multifactorial etiology, mortality in calves is high”</w:t>
+      </w:r>
+      <w:r>
+        <w:t xml:space="preserve"> </w:t>
+      </w:r>
+      <w:r>
+        <w:t xml:space="preserve">says that mortality is a disease complex.</w:t>
+      </w:r>
+    </w:p>
+    <w:p>
+      <w:pPr>
+        <w:pStyle w:val="Compact"/>
+        <w:numPr>
+          <w:ilvl w:val="0"/>
+          <w:numId w:val="1007"/>
+        </w:numPr>
+      </w:pPr>
+      <w:r>
+        <w:t xml:space="preserve">The reader waits for the subject and verb,</w:t>
+      </w:r>
+      <w:r>
+        <w:t xml:space="preserve"> </w:t>
+      </w:r>
+      <w:r>
+        <w:t xml:space="preserve">which runs against the advice to</w:t>
+      </w:r>
+      <w:r>
+        <w:t xml:space="preserve"> </w:t>
+      </w:r>
+      <w:hyperlink r:id="rId25">
+        <w:r>
+          <w:rPr>
+            <w:rStyle w:val="Hyperlink"/>
+          </w:rPr>
+          <w:t xml:space="preserve">lead with the subject</w:t>
+        </w:r>
+      </w:hyperlink>
+      <w:r>
+        <w:t xml:space="preserve">.</w:t>
+      </w:r>
+      <w:r>
+        <w:t xml:space="preserve"> </w:t>
+      </w:r>
+      <w:r>
+        <w:t xml:space="preserve">A long fronted appositive delays them, and a reader may take the phrase for the subject</w:t>
+      </w:r>
+      <w:r>
+        <w:t xml:space="preserve"> </w:t>
+      </w:r>
+      <w:r>
+        <w:t xml:space="preserve">(compare</w:t>
+      </w:r>
+      <w:r>
+        <w:t xml:space="preserve"> </w:t>
+      </w:r>
+      <w:hyperlink w:anchor="avoid-garden-path-sentences">
+        <w:r>
+          <w:rPr>
+            <w:rStyle w:val="Hyperlink"/>
+          </w:rPr>
+          <w:t xml:space="preserve">Avoid garden-path sentences</w:t>
+        </w:r>
+      </w:hyperlink>
+      <w:r>
+        <w:t xml:space="preserve">).</w:t>
+      </w:r>
+    </w:p>
+    <w:p>
+      <w:pPr>
+        <w:pStyle w:val="Compact"/>
+        <w:numPr>
+          <w:ilvl w:val="0"/>
+          <w:numId w:val="1007"/>
+        </w:numPr>
+      </w:pPr>
+      <w:r>
+        <w:t xml:space="preserve">The sentence no longer asserts the description as a main-clause claim,</w:t>
+      </w:r>
+      <w:r>
+        <w:t xml:space="preserve"> </w:t>
+      </w:r>
+      <w:r>
+        <w:t xml:space="preserve">so the reader may treat it as background even when it is the point.</w:t>
+      </w:r>
+    </w:p>
+    <w:p>
+      <w:pPr>
+        <w:pStyle w:val="Compact"/>
+        <w:numPr>
+          <w:ilvl w:val="0"/>
+          <w:numId w:val="1007"/>
+        </w:numPr>
+      </w:pPr>
+      <w:r>
+        <w:t xml:space="preserve">A pronoun subject (</w:t>
+      </w:r>
+      <w:r>
+        <w:t xml:space="preserve">“it”</w:t>
+      </w:r>
+      <w:r>
+        <w:t xml:space="preserve">) needs an antecedent in the previous sentence.</w:t>
+      </w:r>
+      <w:r>
+        <w:t xml:space="preserve"> </w:t>
+      </w:r>
+      <w:r>
+        <w:t xml:space="preserve">A reader who cannot find it must stop to look.</w:t>
+      </w:r>
+    </w:p>
+    <w:p>
+      <w:pPr>
+        <w:pStyle w:val="Compact"/>
+        <w:numPr>
+          <w:ilvl w:val="0"/>
+          <w:numId w:val="1007"/>
+        </w:numPr>
+      </w:pPr>
+      <w:r>
+        <w:t xml:space="preserve">It reads as more formal and literary, which suits some venues and not others.</w:t>
+      </w:r>
+    </w:p>
+    <w:p>
+      <w:pPr>
+        <w:pStyle w:val="FirstParagraph"/>
+      </w:pPr>
+      <w:r>
+        <w:rPr>
+          <w:b/>
+          <w:bCs/>
+        </w:rPr>
+        <w:t xml:space="preserve">Guideline.</w:t>
+      </w:r>
+      <w:r>
+        <w:t xml:space="preserve"> </w:t>
+      </w:r>
+      <w:r>
+        <w:t xml:space="preserve">Front an appositive when it is short, familiar to the reader, and describes the subject.</w:t>
+      </w:r>
+      <w:r>
+        <w:t xml:space="preserve"> </w:t>
+      </w:r>
+      <w:r>
+        <w:t xml:space="preserve">Keep the plain</w:t>
+      </w:r>
+      <w:r>
+        <w:t xml:space="preserve"> </w:t>
+      </w:r>
+      <w:r>
+        <w:t xml:space="preserve">“X is Y”</w:t>
+      </w:r>
+      <w:r>
+        <w:t xml:space="preserve"> </w:t>
+      </w:r>
+      <w:r>
+        <w:t xml:space="preserve">form when the description is the new information the paper depends on,</w:t>
+      </w:r>
+      <w:r>
+        <w:t xml:space="preserve"> </w:t>
+      </w:r>
+      <w:r>
+        <w:t xml:space="preserve">when it is long,</w:t>
+      </w:r>
+      <w:r>
+        <w:t xml:space="preserve"> </w:t>
+      </w:r>
+      <w:r>
+        <w:t xml:space="preserve">or when the subject is a pronoun without a clear antecedent.</w:t>
+      </w:r>
+    </w:p>
+    <w:bookmarkStart w:id="28" w:name="exm-appositive-fronting"/>
+    <w:p>
+      <w:pPr>
+        <w:pStyle w:val="BodyText"/>
+      </w:pPr>
+      <w:r>
+        <w:rPr>
+          <w:b/>
+          <w:bCs/>
+        </w:rPr>
+        <w:t xml:space="preserve">Example 8 (Plain and fronted forms)</w:t>
+      </w:r>
+      <w:r>
+        <w:t xml:space="preserve"> </w:t>
+      </w:r>
+      <w:r>
+        <w:t xml:space="preserve"> </w:t>
+      </w:r>
+    </w:p>
+    <w:p>
+      <w:pPr>
+        <w:pStyle w:val="BlockText"/>
+      </w:pPr>
+      <w:r>
+        <w:t xml:space="preserve">Plain: Bovine respiratory disease (BRD) is a disease complex with a multifactorial etiology</w:t>
+      </w:r>
+      <w:r>
+        <w:t xml:space="preserve"> </w:t>
+      </w:r>
+      <w:r>
+        <w:t xml:space="preserve">and serves as a significant cause of mortality among preweaned calves and weaned cattle alike.</w:t>
+      </w:r>
+    </w:p>
+    <w:p>
+      <w:pPr>
+        <w:pStyle w:val="BlockText"/>
+      </w:pPr>
+      <w:r>
+        <w:t xml:space="preserve">Fronted: A disease complex with a multifactorial etiology,</w:t>
+      </w:r>
+      <w:r>
+        <w:t xml:space="preserve"> </w:t>
+      </w:r>
+      <w:r>
+        <w:t xml:space="preserve">BRD is a leading cause of mortality in both preweaned calves and weaned cattle.</w:t>
+      </w:r>
+    </w:p>
+    <w:p>
+      <w:pPr>
+        <w:pStyle w:val="FirstParagraph"/>
+      </w:pPr>
+      <w:r>
+        <w:t xml:space="preserve">The fronted version is shorter and puts the category first.</w:t>
+      </w:r>
+      <w:r>
+        <w:t xml:space="preserve"> </w:t>
+      </w:r>
+      <w:r>
+        <w:t xml:space="preserve">It works here because</w:t>
+      </w:r>
+      <w:r>
+        <w:t xml:space="preserve"> </w:t>
+      </w:r>
+      <w:r>
+        <w:t xml:space="preserve">“a disease complex with a multifactorial etiology”</w:t>
+      </w:r>
+      <w:r>
+        <w:t xml:space="preserve"> </w:t>
+      </w:r>
+      <w:r>
+        <w:t xml:space="preserve">describes BRD,</w:t>
+      </w:r>
+      <w:r>
+        <w:t xml:space="preserve"> </w:t>
+      </w:r>
+      <w:r>
+        <w:t xml:space="preserve">the subject that follows it, and the subject is named, not a pronoun.</w:t>
+      </w:r>
+      <w:r>
+        <w:t xml:space="preserve"> </w:t>
+      </w:r>
+      <w:r>
+        <w:t xml:space="preserve">If the multifactorial etiology is what the paper is about,</w:t>
+      </w:r>
+      <w:r>
+        <w:t xml:space="preserve"> </w:t>
+      </w:r>
+      <w:r>
+        <w:t xml:space="preserve">the plain form states it as a claim the reader can challenge, and is the better choice.</w:t>
+      </w:r>
+    </w:p>
+    <w:bookmarkEnd w:id="28"/>
+    <w:bookmarkEnd w:id="29"/>
     <w:sectPr>
       <w:footnotePr>
         <w:numRestart w:val="eachSect"/>
@@ -3113,6 +3639,12 @@
     <w:lvlOverride w:ilvl="8">
       <w:startOverride w:val="1"/>
     </w:lvlOverride>
+  </w:num>
+  <w:num w:numId="1006">
+    <w:abstractNumId w:val="991"/>
+  </w:num>
+  <w:num w:numId="1007">
+    <w:abstractNumId w:val="991"/>
   </w:num>
 </w:numbering>
 </file>

</xml_diff>